<commit_message>
create serves and basic project http
</commit_message>
<xml_diff>
--- a/001 - estudo pessoal/013 - Simular servidor HTTP/Manual Passo a Passo servidor HTTP.docx
+++ b/001 - estudo pessoal/013 - Simular servidor HTTP/Manual Passo a Passo servidor HTTP.docx
@@ -588,6 +588,9 @@
     </w:p>
     <w:p>
       <w:r>
+        <w:rPr>
+          <w:noProof/>
+        </w:rPr>
         <w:drawing>
           <wp:inline distT="0" distB="0" distL="0" distR="0" wp14:anchorId="35AB9C8E" wp14:editId="75366DC5">
             <wp:extent cx="5400040" cy="5136515"/>
@@ -626,19 +629,479 @@
       </w:r>
     </w:p>
     <w:p/>
-    <w:p>
-      <w:r>
-        <w:t>2 -</w:t>
-      </w:r>
-    </w:p>
-    <w:p/>
-    <w:p/>
-    <w:p/>
-    <w:p/>
-    <w:p/>
-    <w:p/>
-    <w:p/>
-    <w:p/>
+    <w:p/>
+    <w:p/>
+    <w:p/>
+    <w:p/>
+    <w:p/>
+    <w:p/>
+    <w:p/>
+    <w:p>
+      <w:r>
+        <w:lastRenderedPageBreak/>
+        <w:t xml:space="preserve">2 </w:t>
+      </w:r>
+      <w:r>
+        <w:t xml:space="preserve">– Apos isso conectar cada um no projeto. </w:t>
+      </w:r>
+    </w:p>
+    <w:p>
+      <w:r>
+        <w:t>O servidor 0 na porta FastEthernet0 na porta FastEthernet0</w:t>
+      </w:r>
+      <w:r>
+        <w:t>/</w:t>
+      </w:r>
+      <w:r>
+        <w:t>1 no switch 0.</w:t>
+      </w:r>
+    </w:p>
+    <w:p>
+      <w:r>
+        <w:t xml:space="preserve">O servidor </w:t>
+      </w:r>
+      <w:r>
+        <w:t>1</w:t>
+      </w:r>
+      <w:r>
+        <w:t xml:space="preserve"> na porta FastEthernet0 na porta FastEthernet0</w:t>
+      </w:r>
+      <w:r>
+        <w:t>/</w:t>
+      </w:r>
+      <w:r>
+        <w:t>2</w:t>
+      </w:r>
+      <w:r>
+        <w:t xml:space="preserve"> no switch 0</w:t>
+      </w:r>
+      <w:r>
+        <w:t>.</w:t>
+      </w:r>
+    </w:p>
+    <w:p>
+      <w:r>
+        <w:t xml:space="preserve">O servidor </w:t>
+      </w:r>
+      <w:r>
+        <w:t>2</w:t>
+      </w:r>
+      <w:r>
+        <w:t xml:space="preserve"> na porta FastEthernet0 na porta FastEthernet0</w:t>
+      </w:r>
+      <w:r>
+        <w:t>/</w:t>
+      </w:r>
+      <w:r>
+        <w:t>3</w:t>
+      </w:r>
+      <w:r>
+        <w:t xml:space="preserve"> no switch 0</w:t>
+      </w:r>
+      <w:r>
+        <w:t>.</w:t>
+      </w:r>
+    </w:p>
+    <w:p>
+      <w:r>
+        <w:t xml:space="preserve">O servidor </w:t>
+      </w:r>
+      <w:r>
+        <w:t>3</w:t>
+      </w:r>
+      <w:r>
+        <w:t xml:space="preserve"> na porta FastEthernet0 na porta FastEthernet0</w:t>
+      </w:r>
+      <w:r>
+        <w:t>/</w:t>
+      </w:r>
+      <w:r>
+        <w:t>4</w:t>
+      </w:r>
+      <w:r>
+        <w:t xml:space="preserve"> no switch 0</w:t>
+      </w:r>
+    </w:p>
+    <w:p>
+      <w:r>
+        <w:t>O computador 0 na porta FastEthernet0 com o switch na porta FastEthernet0/5</w:t>
+      </w:r>
+    </w:p>
+    <w:p>
+      <w:r>
+        <w:t xml:space="preserve">O computador </w:t>
+      </w:r>
+      <w:r>
+        <w:t xml:space="preserve">1 </w:t>
+      </w:r>
+      <w:r>
+        <w:t>na porta FastEthernet0 com o switch na porta FastEthernet0</w:t>
+      </w:r>
+      <w:r>
+        <w:t>/6</w:t>
+      </w:r>
+    </w:p>
+    <w:p>
+      <w:r>
+        <w:t xml:space="preserve">O computador </w:t>
+      </w:r>
+      <w:r>
+        <w:t xml:space="preserve">2 </w:t>
+      </w:r>
+      <w:r>
+        <w:t>na porta FastEthernet0 com o switch na porta FastEthernet0</w:t>
+      </w:r>
+      <w:r>
+        <w:t>/7</w:t>
+      </w:r>
+    </w:p>
+    <w:p>
+      <w:r>
+        <w:drawing>
+          <wp:inline distT="0" distB="0" distL="0" distR="0" wp14:anchorId="49D6FA42" wp14:editId="6D186E5A">
+            <wp:extent cx="5400040" cy="4721225"/>
+            <wp:effectExtent l="0" t="0" r="0" b="3175"/>
+            <wp:docPr id="1320166798" name="Picture 1"/>
+            <wp:cNvGraphicFramePr>
+              <a:graphicFrameLocks xmlns:a="http://schemas.openxmlformats.org/drawingml/2006/main" noChangeAspect="1"/>
+            </wp:cNvGraphicFramePr>
+            <a:graphic xmlns:a="http://schemas.openxmlformats.org/drawingml/2006/main">
+              <a:graphicData uri="http://schemas.openxmlformats.org/drawingml/2006/picture">
+                <pic:pic xmlns:pic="http://schemas.openxmlformats.org/drawingml/2006/picture">
+                  <pic:nvPicPr>
+                    <pic:cNvPr id="1320166798" name=""/>
+                    <pic:cNvPicPr/>
+                  </pic:nvPicPr>
+                  <pic:blipFill>
+                    <a:blip r:embed="rId7"/>
+                    <a:stretch>
+                      <a:fillRect/>
+                    </a:stretch>
+                  </pic:blipFill>
+                  <pic:spPr>
+                    <a:xfrm>
+                      <a:off x="0" y="0"/>
+                      <a:ext cx="5400040" cy="4721225"/>
+                    </a:xfrm>
+                    <a:prstGeom prst="rect">
+                      <a:avLst/>
+                    </a:prstGeom>
+                  </pic:spPr>
+                </pic:pic>
+              </a:graphicData>
+            </a:graphic>
+          </wp:inline>
+        </w:drawing>
+      </w:r>
+    </w:p>
+    <w:p/>
+    <w:p/>
+    <w:p/>
+    <w:p/>
+    <w:p/>
+    <w:p/>
+    <w:p>
+      <w:r>
+        <w:lastRenderedPageBreak/>
+        <w:t>3 – No menu lateral superior selecionar a opcao de notas</w:t>
+      </w:r>
+    </w:p>
+    <w:p>
+      <w:r>
+        <w:drawing>
+          <wp:inline distT="0" distB="0" distL="0" distR="0" wp14:anchorId="77B255B0" wp14:editId="1F054054">
+            <wp:extent cx="5400040" cy="882015"/>
+            <wp:effectExtent l="0" t="0" r="0" b="0"/>
+            <wp:docPr id="1505236365" name="Picture 1"/>
+            <wp:cNvGraphicFramePr>
+              <a:graphicFrameLocks xmlns:a="http://schemas.openxmlformats.org/drawingml/2006/main" noChangeAspect="1"/>
+            </wp:cNvGraphicFramePr>
+            <a:graphic xmlns:a="http://schemas.openxmlformats.org/drawingml/2006/main">
+              <a:graphicData uri="http://schemas.openxmlformats.org/drawingml/2006/picture">
+                <pic:pic xmlns:pic="http://schemas.openxmlformats.org/drawingml/2006/picture">
+                  <pic:nvPicPr>
+                    <pic:cNvPr id="1505236365" name=""/>
+                    <pic:cNvPicPr/>
+                  </pic:nvPicPr>
+                  <pic:blipFill>
+                    <a:blip r:embed="rId8"/>
+                    <a:stretch>
+                      <a:fillRect/>
+                    </a:stretch>
+                  </pic:blipFill>
+                  <pic:spPr>
+                    <a:xfrm>
+                      <a:off x="0" y="0"/>
+                      <a:ext cx="5400040" cy="882015"/>
+                    </a:xfrm>
+                    <a:prstGeom prst="rect">
+                      <a:avLst/>
+                    </a:prstGeom>
+                  </pic:spPr>
+                </pic:pic>
+              </a:graphicData>
+            </a:graphic>
+          </wp:inline>
+        </w:drawing>
+      </w:r>
+    </w:p>
+    <w:p/>
+    <w:p>
+      <w:r>
+        <w:t>4 – criado um endereco para usar como base dentro do servidor</w:t>
+      </w:r>
+    </w:p>
+    <w:p>
+      <w:r>
+        <w:drawing>
+          <wp:inline distT="0" distB="0" distL="0" distR="0" wp14:anchorId="0201C7FC" wp14:editId="1961B98F">
+            <wp:extent cx="2295845" cy="685896"/>
+            <wp:effectExtent l="0" t="0" r="0" b="0"/>
+            <wp:docPr id="208997963" name="Picture 1"/>
+            <wp:cNvGraphicFramePr>
+              <a:graphicFrameLocks xmlns:a="http://schemas.openxmlformats.org/drawingml/2006/main" noChangeAspect="1"/>
+            </wp:cNvGraphicFramePr>
+            <a:graphic xmlns:a="http://schemas.openxmlformats.org/drawingml/2006/main">
+              <a:graphicData uri="http://schemas.openxmlformats.org/drawingml/2006/picture">
+                <pic:pic xmlns:pic="http://schemas.openxmlformats.org/drawingml/2006/picture">
+                  <pic:nvPicPr>
+                    <pic:cNvPr id="208997963" name=""/>
+                    <pic:cNvPicPr/>
+                  </pic:nvPicPr>
+                  <pic:blipFill>
+                    <a:blip r:embed="rId9"/>
+                    <a:stretch>
+                      <a:fillRect/>
+                    </a:stretch>
+                  </pic:blipFill>
+                  <pic:spPr>
+                    <a:xfrm>
+                      <a:off x="0" y="0"/>
+                      <a:ext cx="2295845" cy="685896"/>
+                    </a:xfrm>
+                    <a:prstGeom prst="rect">
+                      <a:avLst/>
+                    </a:prstGeom>
+                  </pic:spPr>
+                </pic:pic>
+              </a:graphicData>
+            </a:graphic>
+          </wp:inline>
+        </w:drawing>
+      </w:r>
+    </w:p>
+    <w:p/>
+    <w:p/>
+    <w:p/>
+    <w:p/>
+    <w:p/>
+    <w:p/>
+    <w:p/>
+    <w:p/>
+    <w:p/>
+    <w:p/>
+    <w:p/>
+    <w:p/>
+    <w:p/>
+    <w:p/>
+    <w:p/>
+    <w:p/>
+    <w:p/>
+    <w:p/>
+    <w:p/>
+    <w:p/>
+    <w:p/>
+    <w:p>
+      <w:r>
+        <w:lastRenderedPageBreak/>
+        <w:t xml:space="preserve">5 – Nomear cada um dos servidores para as funcoes que irei necessitar. </w:t>
+      </w:r>
+    </w:p>
+    <w:p>
+      <w:r>
+        <w:t>O servidor 0 sera o DHCP</w:t>
+      </w:r>
+    </w:p>
+    <w:p>
+      <w:r>
+        <w:t>O servidor 1 sera o DNS</w:t>
+      </w:r>
+    </w:p>
+    <w:p>
+      <w:r>
+        <w:t>O servidor 2 sera o servidor google</w:t>
+      </w:r>
+    </w:p>
+    <w:p>
+      <w:r>
+        <w:t>O servidor 3 sera o servidor Yahoo</w:t>
+      </w:r>
+    </w:p>
+    <w:p>
+      <w:r>
+        <w:t>Para nomear cada um dos servidores necessario entrar no menu do servidor -&gt; config e ir na aba display name, entao digitar o nome desejado</w:t>
+      </w:r>
+    </w:p>
+    <w:p>
+      <w:r>
+        <w:drawing>
+          <wp:inline distT="0" distB="0" distL="0" distR="0" wp14:anchorId="59F61906" wp14:editId="4E48FEF9">
+            <wp:extent cx="5400040" cy="1565910"/>
+            <wp:effectExtent l="0" t="0" r="0" b="0"/>
+            <wp:docPr id="1808777152" name="Picture 1"/>
+            <wp:cNvGraphicFramePr>
+              <a:graphicFrameLocks xmlns:a="http://schemas.openxmlformats.org/drawingml/2006/main" noChangeAspect="1"/>
+            </wp:cNvGraphicFramePr>
+            <a:graphic xmlns:a="http://schemas.openxmlformats.org/drawingml/2006/main">
+              <a:graphicData uri="http://schemas.openxmlformats.org/drawingml/2006/picture">
+                <pic:pic xmlns:pic="http://schemas.openxmlformats.org/drawingml/2006/picture">
+                  <pic:nvPicPr>
+                    <pic:cNvPr id="1808777152" name=""/>
+                    <pic:cNvPicPr/>
+                  </pic:nvPicPr>
+                  <pic:blipFill>
+                    <a:blip r:embed="rId10"/>
+                    <a:stretch>
+                      <a:fillRect/>
+                    </a:stretch>
+                  </pic:blipFill>
+                  <pic:spPr>
+                    <a:xfrm>
+                      <a:off x="0" y="0"/>
+                      <a:ext cx="5400040" cy="1565910"/>
+                    </a:xfrm>
+                    <a:prstGeom prst="rect">
+                      <a:avLst/>
+                    </a:prstGeom>
+                  </pic:spPr>
+                </pic:pic>
+              </a:graphicData>
+            </a:graphic>
+          </wp:inline>
+        </w:drawing>
+      </w:r>
+    </w:p>
+    <w:p/>
+    <w:p>
+      <w:r>
+        <w:drawing>
+          <wp:inline distT="0" distB="0" distL="0" distR="0" wp14:anchorId="5F99B37F" wp14:editId="3AC45A1C">
+            <wp:extent cx="5400040" cy="1527175"/>
+            <wp:effectExtent l="0" t="0" r="0" b="0"/>
+            <wp:docPr id="1513784397" name="Picture 1"/>
+            <wp:cNvGraphicFramePr>
+              <a:graphicFrameLocks xmlns:a="http://schemas.openxmlformats.org/drawingml/2006/main" noChangeAspect="1"/>
+            </wp:cNvGraphicFramePr>
+            <a:graphic xmlns:a="http://schemas.openxmlformats.org/drawingml/2006/main">
+              <a:graphicData uri="http://schemas.openxmlformats.org/drawingml/2006/picture">
+                <pic:pic xmlns:pic="http://schemas.openxmlformats.org/drawingml/2006/picture">
+                  <pic:nvPicPr>
+                    <pic:cNvPr id="1513784397" name=""/>
+                    <pic:cNvPicPr/>
+                  </pic:nvPicPr>
+                  <pic:blipFill>
+                    <a:blip r:embed="rId11"/>
+                    <a:stretch>
+                      <a:fillRect/>
+                    </a:stretch>
+                  </pic:blipFill>
+                  <pic:spPr>
+                    <a:xfrm>
+                      <a:off x="0" y="0"/>
+                      <a:ext cx="5400040" cy="1527175"/>
+                    </a:xfrm>
+                    <a:prstGeom prst="rect">
+                      <a:avLst/>
+                    </a:prstGeom>
+                  </pic:spPr>
+                </pic:pic>
+              </a:graphicData>
+            </a:graphic>
+          </wp:inline>
+        </w:drawing>
+      </w:r>
+    </w:p>
+    <w:p/>
+    <w:p>
+      <w:r>
+        <w:drawing>
+          <wp:inline distT="0" distB="0" distL="0" distR="0" wp14:anchorId="36AF3889" wp14:editId="6653527F">
+            <wp:extent cx="5400040" cy="1897380"/>
+            <wp:effectExtent l="0" t="0" r="0" b="7620"/>
+            <wp:docPr id="2058202772" name="Picture 1"/>
+            <wp:cNvGraphicFramePr>
+              <a:graphicFrameLocks xmlns:a="http://schemas.openxmlformats.org/drawingml/2006/main" noChangeAspect="1"/>
+            </wp:cNvGraphicFramePr>
+            <a:graphic xmlns:a="http://schemas.openxmlformats.org/drawingml/2006/main">
+              <a:graphicData uri="http://schemas.openxmlformats.org/drawingml/2006/picture">
+                <pic:pic xmlns:pic="http://schemas.openxmlformats.org/drawingml/2006/picture">
+                  <pic:nvPicPr>
+                    <pic:cNvPr id="2058202772" name=""/>
+                    <pic:cNvPicPr/>
+                  </pic:nvPicPr>
+                  <pic:blipFill>
+                    <a:blip r:embed="rId12"/>
+                    <a:stretch>
+                      <a:fillRect/>
+                    </a:stretch>
+                  </pic:blipFill>
+                  <pic:spPr>
+                    <a:xfrm>
+                      <a:off x="0" y="0"/>
+                      <a:ext cx="5400040" cy="1897380"/>
+                    </a:xfrm>
+                    <a:prstGeom prst="rect">
+                      <a:avLst/>
+                    </a:prstGeom>
+                  </pic:spPr>
+                </pic:pic>
+              </a:graphicData>
+            </a:graphic>
+          </wp:inline>
+        </w:drawing>
+      </w:r>
+    </w:p>
+    <w:p/>
+    <w:p>
+      <w:r>
+        <w:lastRenderedPageBreak/>
+        <w:drawing>
+          <wp:inline distT="0" distB="0" distL="0" distR="0" wp14:anchorId="1DAA22AD" wp14:editId="3E0DA565">
+            <wp:extent cx="5400040" cy="1590675"/>
+            <wp:effectExtent l="0" t="0" r="0" b="9525"/>
+            <wp:docPr id="151926801" name="Picture 1"/>
+            <wp:cNvGraphicFramePr>
+              <a:graphicFrameLocks xmlns:a="http://schemas.openxmlformats.org/drawingml/2006/main" noChangeAspect="1"/>
+            </wp:cNvGraphicFramePr>
+            <a:graphic xmlns:a="http://schemas.openxmlformats.org/drawingml/2006/main">
+              <a:graphicData uri="http://schemas.openxmlformats.org/drawingml/2006/picture">
+                <pic:pic xmlns:pic="http://schemas.openxmlformats.org/drawingml/2006/picture">
+                  <pic:nvPicPr>
+                    <pic:cNvPr id="151926801" name=""/>
+                    <pic:cNvPicPr/>
+                  </pic:nvPicPr>
+                  <pic:blipFill>
+                    <a:blip r:embed="rId13"/>
+                    <a:stretch>
+                      <a:fillRect/>
+                    </a:stretch>
+                  </pic:blipFill>
+                  <pic:spPr>
+                    <a:xfrm>
+                      <a:off x="0" y="0"/>
+                      <a:ext cx="5400040" cy="1590675"/>
+                    </a:xfrm>
+                    <a:prstGeom prst="rect">
+                      <a:avLst/>
+                    </a:prstGeom>
+                  </pic:spPr>
+                </pic:pic>
+              </a:graphicData>
+            </a:graphic>
+          </wp:inline>
+        </w:drawing>
+      </w:r>
+    </w:p>
     <w:p>
       <w:r>
         <w:br w:type="page"/>

</xml_diff>